<commit_message>
Hardware: la versión gráfica pasa a ser la página principal, con la paleta Consein
- Azul oscuro #1B245B y verde #58BB47 en estilos, iconos e ilustraciones
- index.html es ahora la versión gráfica; se retira la minimalista
- Documento SEO actualizado con la misma paleta

Co-Authored-By: Claude Opus 5.5 <noreply@anthropic.com>
Claude-Session: https://claude.ai/code/session_011okse75kZLz3RLncb7291s
</commit_message>
<xml_diff>
--- a/consein-hardware/seo/Palabras-clave-SEO-Hardware-Consein.docx
+++ b/consein-hardware/seo/Palabras-clave-SEO-Hardware-Consein.docx
@@ -11,7 +11,7 @@
           <w:rFonts w:ascii="Poppins" w:cs="Poppins" w:eastAsia="Poppins" w:hAnsi="Poppins"/>
           <w:b/>
           <w:bCs/>
-          <w:color w:val="000F76"/>
+          <w:color w:val="1B245B"/>
           <w:sz w:val="44"/>
           <w:szCs w:val="44"/>
         </w:rPr>
@@ -37,7 +37,7 @@
     <w:p>
       <w:pPr>
         <w:pBdr>
-          <w:bottom w:val="single" w:color="61FC22" w:sz="12" w:space="4"/>
+          <w:bottom w:val="single" w:color="58BB47" w:sz="12" w:space="4"/>
         </w:pBdr>
         <w:spacing w:after="240"/>
       </w:pPr>
@@ -48,7 +48,7 @@
       </w:pPr>
       <w:r>
         <w:rPr>
-          <w:color w:val="000F76"/>
+          <w:color w:val="1B245B"/>
         </w:rPr>
         <w:t xml:space="preserve">Objetivo</w:t>
       </w:r>
@@ -71,7 +71,7 @@
       </w:pPr>
       <w:r>
         <w:rPr>
-          <w:color w:val="000F76"/>
+          <w:color w:val="1B245B"/>
         </w:rPr>
         <w:t xml:space="preserve">Cómo leer este documento</w:t>
       </w:r>
@@ -151,7 +151,7 @@
       </w:pPr>
       <w:r>
         <w:rPr>
-          <w:color w:val="000F76"/>
+          <w:color w:val="1B245B"/>
         </w:rPr>
         <w:t xml:space="preserve">Palabras clave por especialidad</w:t>
       </w:r>
@@ -163,7 +163,7 @@
       </w:pPr>
       <w:r>
         <w:rPr>
-          <w:color w:val="000F76"/>
+          <w:color w:val="1B245B"/>
         </w:rPr>
         <w:t xml:space="preserve">1. Computación empresarial</w:t>
       </w:r>
@@ -216,7 +216,7 @@
               <w:bottom w:val="single" w:color="D9DCE8" w:sz="4"/>
               <w:right w:val="single" w:color="D9DCE8" w:sz="4"/>
             </w:tcBorders>
-            <w:shd w:fill="000F76" w:color="auto" w:val="clear"/>
+            <w:shd w:fill="1B245B" w:color="auto" w:val="clear"/>
             <w:tcMar>
               <w:top w:type="dxa" w:w="80"/>
               <w:left w:type="dxa" w:w="120"/>
@@ -246,7 +246,7 @@
               <w:bottom w:val="single" w:color="D9DCE8" w:sz="4"/>
               <w:right w:val="single" w:color="D9DCE8" w:sz="4"/>
             </w:tcBorders>
-            <w:shd w:fill="000F76" w:color="auto" w:val="clear"/>
+            <w:shd w:fill="1B245B" w:color="auto" w:val="clear"/>
             <w:tcMar>
               <w:top w:type="dxa" w:w="80"/>
               <w:left w:type="dxa" w:w="120"/>
@@ -276,7 +276,7 @@
               <w:bottom w:val="single" w:color="D9DCE8" w:sz="4"/>
               <w:right w:val="single" w:color="D9DCE8" w:sz="4"/>
             </w:tcBorders>
-            <w:shd w:fill="000F76" w:color="auto" w:val="clear"/>
+            <w:shd w:fill="1B245B" w:color="auto" w:val="clear"/>
             <w:tcMar>
               <w:top w:type="dxa" w:w="80"/>
               <w:left w:type="dxa" w:w="120"/>
@@ -513,7 +513,7 @@
       </w:pPr>
       <w:r>
         <w:rPr>
-          <w:color w:val="000F76"/>
+          <w:color w:val="1B245B"/>
         </w:rPr>
         <w:t xml:space="preserve">2. Servidores e infraestructura</w:t>
       </w:r>
@@ -566,7 +566,7 @@
               <w:bottom w:val="single" w:color="D9DCE8" w:sz="4"/>
               <w:right w:val="single" w:color="D9DCE8" w:sz="4"/>
             </w:tcBorders>
-            <w:shd w:fill="000F76" w:color="auto" w:val="clear"/>
+            <w:shd w:fill="1B245B" w:color="auto" w:val="clear"/>
             <w:tcMar>
               <w:top w:type="dxa" w:w="80"/>
               <w:left w:type="dxa" w:w="120"/>
@@ -596,7 +596,7 @@
               <w:bottom w:val="single" w:color="D9DCE8" w:sz="4"/>
               <w:right w:val="single" w:color="D9DCE8" w:sz="4"/>
             </w:tcBorders>
-            <w:shd w:fill="000F76" w:color="auto" w:val="clear"/>
+            <w:shd w:fill="1B245B" w:color="auto" w:val="clear"/>
             <w:tcMar>
               <w:top w:type="dxa" w:w="80"/>
               <w:left w:type="dxa" w:w="120"/>
@@ -626,7 +626,7 @@
               <w:bottom w:val="single" w:color="D9DCE8" w:sz="4"/>
               <w:right w:val="single" w:color="D9DCE8" w:sz="4"/>
             </w:tcBorders>
-            <w:shd w:fill="000F76" w:color="auto" w:val="clear"/>
+            <w:shd w:fill="1B245B" w:color="auto" w:val="clear"/>
             <w:tcMar>
               <w:top w:type="dxa" w:w="80"/>
               <w:left w:type="dxa" w:w="120"/>
@@ -852,7 +852,7 @@
       </w:pPr>
       <w:r>
         <w:rPr>
-          <w:color w:val="000F76"/>
+          <w:color w:val="1B245B"/>
         </w:rPr>
         <w:t xml:space="preserve">3. Espacios de colaboración</w:t>
       </w:r>
@@ -905,7 +905,7 @@
               <w:bottom w:val="single" w:color="D9DCE8" w:sz="4"/>
               <w:right w:val="single" w:color="D9DCE8" w:sz="4"/>
             </w:tcBorders>
-            <w:shd w:fill="000F76" w:color="auto" w:val="clear"/>
+            <w:shd w:fill="1B245B" w:color="auto" w:val="clear"/>
             <w:tcMar>
               <w:top w:type="dxa" w:w="80"/>
               <w:left w:type="dxa" w:w="120"/>
@@ -935,7 +935,7 @@
               <w:bottom w:val="single" w:color="D9DCE8" w:sz="4"/>
               <w:right w:val="single" w:color="D9DCE8" w:sz="4"/>
             </w:tcBorders>
-            <w:shd w:fill="000F76" w:color="auto" w:val="clear"/>
+            <w:shd w:fill="1B245B" w:color="auto" w:val="clear"/>
             <w:tcMar>
               <w:top w:type="dxa" w:w="80"/>
               <w:left w:type="dxa" w:w="120"/>
@@ -965,7 +965,7 @@
               <w:bottom w:val="single" w:color="D9DCE8" w:sz="4"/>
               <w:right w:val="single" w:color="D9DCE8" w:sz="4"/>
             </w:tcBorders>
-            <w:shd w:fill="000F76" w:color="auto" w:val="clear"/>
+            <w:shd w:fill="1B245B" w:color="auto" w:val="clear"/>
             <w:tcMar>
               <w:top w:type="dxa" w:w="80"/>
               <w:left w:type="dxa" w:w="120"/>
@@ -1169,7 +1169,7 @@
       </w:pPr>
       <w:r>
         <w:rPr>
-          <w:color w:val="000F76"/>
+          <w:color w:val="1B245B"/>
         </w:rPr>
         <w:t xml:space="preserve">4. Importación puerta a puerta</w:t>
       </w:r>
@@ -1222,7 +1222,7 @@
               <w:bottom w:val="single" w:color="D9DCE8" w:sz="4"/>
               <w:right w:val="single" w:color="D9DCE8" w:sz="4"/>
             </w:tcBorders>
-            <w:shd w:fill="000F76" w:color="auto" w:val="clear"/>
+            <w:shd w:fill="1B245B" w:color="auto" w:val="clear"/>
             <w:tcMar>
               <w:top w:type="dxa" w:w="80"/>
               <w:left w:type="dxa" w:w="120"/>
@@ -1252,7 +1252,7 @@
               <w:bottom w:val="single" w:color="D9DCE8" w:sz="4"/>
               <w:right w:val="single" w:color="D9DCE8" w:sz="4"/>
             </w:tcBorders>
-            <w:shd w:fill="000F76" w:color="auto" w:val="clear"/>
+            <w:shd w:fill="1B245B" w:color="auto" w:val="clear"/>
             <w:tcMar>
               <w:top w:type="dxa" w:w="80"/>
               <w:left w:type="dxa" w:w="120"/>
@@ -1282,7 +1282,7 @@
               <w:bottom w:val="single" w:color="D9DCE8" w:sz="4"/>
               <w:right w:val="single" w:color="D9DCE8" w:sz="4"/>
             </w:tcBorders>
-            <w:shd w:fill="000F76" w:color="auto" w:val="clear"/>
+            <w:shd w:fill="1B245B" w:color="auto" w:val="clear"/>
             <w:tcMar>
               <w:top w:type="dxa" w:w="80"/>
               <w:left w:type="dxa" w:w="120"/>
@@ -1475,7 +1475,7 @@
       </w:pPr>
       <w:r>
         <w:rPr>
-          <w:color w:val="000F76"/>
+          <w:color w:val="1B245B"/>
         </w:rPr>
         <w:t xml:space="preserve">5. Arquitectura de la solución</w:t>
       </w:r>
@@ -1528,7 +1528,7 @@
               <w:bottom w:val="single" w:color="D9DCE8" w:sz="4"/>
               <w:right w:val="single" w:color="D9DCE8" w:sz="4"/>
             </w:tcBorders>
-            <w:shd w:fill="000F76" w:color="auto" w:val="clear"/>
+            <w:shd w:fill="1B245B" w:color="auto" w:val="clear"/>
             <w:tcMar>
               <w:top w:type="dxa" w:w="80"/>
               <w:left w:type="dxa" w:w="120"/>
@@ -1558,7 +1558,7 @@
               <w:bottom w:val="single" w:color="D9DCE8" w:sz="4"/>
               <w:right w:val="single" w:color="D9DCE8" w:sz="4"/>
             </w:tcBorders>
-            <w:shd w:fill="000F76" w:color="auto" w:val="clear"/>
+            <w:shd w:fill="1B245B" w:color="auto" w:val="clear"/>
             <w:tcMar>
               <w:top w:type="dxa" w:w="80"/>
               <w:left w:type="dxa" w:w="120"/>
@@ -1588,7 +1588,7 @@
               <w:bottom w:val="single" w:color="D9DCE8" w:sz="4"/>
               <w:right w:val="single" w:color="D9DCE8" w:sz="4"/>
             </w:tcBorders>
-            <w:shd w:fill="000F76" w:color="auto" w:val="clear"/>
+            <w:shd w:fill="1B245B" w:color="auto" w:val="clear"/>
             <w:tcMar>
               <w:top w:type="dxa" w:w="80"/>
               <w:left w:type="dxa" w:w="120"/>
@@ -1781,7 +1781,7 @@
       </w:pPr>
       <w:r>
         <w:rPr>
-          <w:color w:val="000F76"/>
+          <w:color w:val="1B245B"/>
         </w:rPr>
         <w:t xml:space="preserve">6. Configuración e instalación</w:t>
       </w:r>
@@ -1834,7 +1834,7 @@
               <w:bottom w:val="single" w:color="D9DCE8" w:sz="4"/>
               <w:right w:val="single" w:color="D9DCE8" w:sz="4"/>
             </w:tcBorders>
-            <w:shd w:fill="000F76" w:color="auto" w:val="clear"/>
+            <w:shd w:fill="1B245B" w:color="auto" w:val="clear"/>
             <w:tcMar>
               <w:top w:type="dxa" w:w="80"/>
               <w:left w:type="dxa" w:w="120"/>
@@ -1864,7 +1864,7 @@
               <w:bottom w:val="single" w:color="D9DCE8" w:sz="4"/>
               <w:right w:val="single" w:color="D9DCE8" w:sz="4"/>
             </w:tcBorders>
-            <w:shd w:fill="000F76" w:color="auto" w:val="clear"/>
+            <w:shd w:fill="1B245B" w:color="auto" w:val="clear"/>
             <w:tcMar>
               <w:top w:type="dxa" w:w="80"/>
               <w:left w:type="dxa" w:w="120"/>
@@ -1894,7 +1894,7 @@
               <w:bottom w:val="single" w:color="D9DCE8" w:sz="4"/>
               <w:right w:val="single" w:color="D9DCE8" w:sz="4"/>
             </w:tcBorders>
-            <w:shd w:fill="000F76" w:color="auto" w:val="clear"/>
+            <w:shd w:fill="1B245B" w:color="auto" w:val="clear"/>
             <w:tcMar>
               <w:top w:type="dxa" w:w="80"/>
               <w:left w:type="dxa" w:w="120"/>
@@ -2098,7 +2098,7 @@
       </w:pPr>
       <w:r>
         <w:rPr>
-          <w:color w:val="000F76"/>
+          <w:color w:val="1B245B"/>
         </w:rPr>
         <w:t xml:space="preserve">7. Soporte técnico y mantenimiento</w:t>
       </w:r>
@@ -2151,7 +2151,7 @@
               <w:bottom w:val="single" w:color="D9DCE8" w:sz="4"/>
               <w:right w:val="single" w:color="D9DCE8" w:sz="4"/>
             </w:tcBorders>
-            <w:shd w:fill="000F76" w:color="auto" w:val="clear"/>
+            <w:shd w:fill="1B245B" w:color="auto" w:val="clear"/>
             <w:tcMar>
               <w:top w:type="dxa" w:w="80"/>
               <w:left w:type="dxa" w:w="120"/>
@@ -2181,7 +2181,7 @@
               <w:bottom w:val="single" w:color="D9DCE8" w:sz="4"/>
               <w:right w:val="single" w:color="D9DCE8" w:sz="4"/>
             </w:tcBorders>
-            <w:shd w:fill="000F76" w:color="auto" w:val="clear"/>
+            <w:shd w:fill="1B245B" w:color="auto" w:val="clear"/>
             <w:tcMar>
               <w:top w:type="dxa" w:w="80"/>
               <w:left w:type="dxa" w:w="120"/>
@@ -2211,7 +2211,7 @@
               <w:bottom w:val="single" w:color="D9DCE8" w:sz="4"/>
               <w:right w:val="single" w:color="D9DCE8" w:sz="4"/>
             </w:tcBorders>
-            <w:shd w:fill="000F76" w:color="auto" w:val="clear"/>
+            <w:shd w:fill="1B245B" w:color="auto" w:val="clear"/>
             <w:tcMar>
               <w:top w:type="dxa" w:w="80"/>
               <w:left w:type="dxa" w:w="120"/>
@@ -2404,7 +2404,7 @@
       </w:pPr>
       <w:r>
         <w:rPr>
-          <w:color w:val="000F76"/>
+          <w:color w:val="1B245B"/>
         </w:rPr>
         <w:t xml:space="preserve">Términos de marca</w:t>
       </w:r>
@@ -2479,7 +2479,7 @@
       </w:pPr>
       <w:r>
         <w:rPr>
-          <w:color w:val="000F76"/>
+          <w:color w:val="1B245B"/>
         </w:rPr>
         <w:t xml:space="preserve">Variantes por mercado</w:t>
       </w:r>
@@ -2571,7 +2571,7 @@
       </w:pPr>
       <w:r>
         <w:rPr>
-          <w:color w:val="000F76"/>
+          <w:color w:val="1B245B"/>
         </w:rPr>
         <w:t xml:space="preserve">Lo que ya aplicamos en la página</w:t>
       </w:r>
@@ -2668,7 +2668,7 @@
       </w:pPr>
       <w:r>
         <w:rPr>
-          <w:color w:val="000F76"/>
+          <w:color w:val="1B245B"/>
         </w:rPr>
         <w:t xml:space="preserve">Próximos pasos sugeridos</w:t>
       </w:r>
@@ -3116,7 +3116,7 @@
       <w:rFonts w:ascii="Poppins" w:cs="Poppins" w:eastAsia="Poppins" w:hAnsi="Poppins"/>
       <w:b/>
       <w:bCs/>
-      <w:color w:val="000F76"/>
+      <w:color w:val="1B245B"/>
       <w:sz w:val="30"/>
       <w:szCs w:val="30"/>
     </w:rPr>
@@ -3134,7 +3134,7 @@
       <w:rFonts w:ascii="Poppins" w:cs="Poppins" w:eastAsia="Poppins" w:hAnsi="Poppins"/>
       <w:b/>
       <w:bCs/>
-      <w:color w:val="000F76"/>
+      <w:color w:val="1B245B"/>
       <w:sz w:val="25"/>
       <w:szCs w:val="25"/>
     </w:rPr>

</xml_diff>